<commit_message>
Prepare publication: dataset placeholders and gitignore, external/README, CITATION.cff, human disclaimer in README; remap commit hashes after scrubbing local paths from history; rebuild manuscript
</commit_message>
<xml_diff>
--- a/manuscript/manuscript.docx
+++ b/manuscript/manuscript.docx
@@ -1383,7 +1383,7 @@
         <w:t xml:space="preserve"> </w:t>
       </w:r>
       <w:r>
-        <w:t xml:space="preserve">logged before the hold-out was opened (LOOKS.md, commit f0f7aa3).</w:t>
+        <w:t xml:space="preserve">logged before the hold-out was opened (LOOKS.md, commit fa21808).</w:t>
       </w:r>
     </w:p>
     <w:bookmarkEnd w:id="23"/>
@@ -9428,7 +9428,7 @@
         <w:t xml:space="preserve"> </w:t>
       </w:r>
       <w:r>
-        <w:t xml:space="preserve">the results (feb6172), so the order rests on the agents’ record, as for the primary look. All are labelled</w:t>
+        <w:t xml:space="preserve">the results (b39691d), so the order rests on the agents’ record, as for the primary look. All are labelled</w:t>
       </w:r>
       <w:r>
         <w:t xml:space="preserve"> </w:t>
@@ -10212,13 +10212,13 @@
         <w:t xml:space="preserve"> </w:t>
       </w:r>
       <w:r>
-        <w:t xml:space="preserve">(complementarity) and the post-review exploratory analyses. Only the specification row (commit f0f7aa3) demonstrably</w:t>
-      </w:r>
-      <w:r>
-        <w:t xml:space="preserve"> </w:t>
-      </w:r>
-      <w:r>
-        <w:t xml:space="preserve">preceded the primary look (7db89d2), by 31 minutes; the rows for the primary look, the verification re-run, the</w:t>
+        <w:t xml:space="preserve">(complementarity) and the post-review exploratory analyses. Only the specification row (commit fa21808) demonstrably</w:t>
+      </w:r>
+      <w:r>
+        <w:t xml:space="preserve"> </w:t>
+      </w:r>
+      <w:r>
+        <w:t xml:space="preserve">preceded the primary look (aa381fc), by 31 minutes; the rows for the primary look, the verification re-run, the</w:t>
       </w:r>
       <w:r>
         <w:t xml:space="preserve"> </w:t>
@@ -10481,13 +10481,13 @@
         <w:t xml:space="preserve"> </w:t>
       </w:r>
       <w:r>
-        <w:t xml:space="preserve">module-label crediting in the judge instruction (logged retrospectively during manuscript review in commit 017fa97;</w:t>
-      </w:r>
-      <w:r>
-        <w:t xml:space="preserve"> </w:t>
-      </w:r>
-      <w:r>
-        <w:t xml:space="preserve">the row’s date was first written as a later day and corrected in place in commit 95a40cc, so the commit, not the date,</w:t>
+        <w:t xml:space="preserve">module-label crediting in the judge instruction (logged retrospectively during manuscript review in commit acdad5a;</w:t>
+      </w:r>
+      <w:r>
+        <w:t xml:space="preserve"> </w:t>
+      </w:r>
+      <w:r>
+        <w:t xml:space="preserve">the row’s date was first written as a later day and corrected in place in commit 090a7d8, so the commit, not the date,</w:t>
       </w:r>
       <w:r>
         <w:t xml:space="preserve"> </w:t>

</xml_diff>